<commit_message>
fix: Toi uu hoa ket noi DB context-scoped, tang timeout 120s chong loi 502 Bad Gateway va phan quyen xuat bao cao Excel theo cum ASM
</commit_message>
<xml_diff>
--- a/HƯỚNG DẪN SỬ DỤNG WEB PORTAL NHẬP LIỆU BÁO CÁO.docx
+++ b/HƯỚNG DẪN SỬ DỤNG WEB PORTAL NHẬP LIỆU BÁO CÁO.docx
@@ -1,6 +1,6 @@
 
 <file path=word/document.xml><?xml version="1.0" encoding="utf-8"?>
-<w:document xmlns:wpc="http://schemas.microsoft.com/office/word/2010/wordprocessingCanvas" xmlns:cx="http://schemas.microsoft.com/office/drawing/2014/chartex" xmlns:cx1="http://schemas.microsoft.com/office/drawing/2015/9/8/chartex" xmlns:cx2="http://schemas.microsoft.com/office/drawing/2015/10/21/chartex" xmlns:cx3="http://schemas.microsoft.com/office/drawing/2016/5/9/chartex" xmlns:cx4="http://schemas.microsoft.com/office/drawing/2016/5/10/chartex" xmlns:cx5="http://schemas.microsoft.com/office/drawing/2016/5/11/chartex" xmlns:cx6="http://schemas.microsoft.com/office/drawing/2016/5/12/chartex" xmlns:cx7="http://schemas.microsoft.com/office/drawing/2016/5/13/chartex" xmlns:cx8="http://schemas.microsoft.com/office/drawing/2016/5/14/chartex" xmlns:mc="http://schemas.openxmlformats.org/markup-compatibility/2006" xmlns:aink="http://schemas.microsoft.com/office/drawing/2016/ink" xmlns:am3d="http://schemas.microsoft.com/office/drawing/2017/model3d" xmlns:o="urn:schemas-microsoft-com:office:office" xmlns:oel="http://schemas.microsoft.com/office/2019/extlst" xmlns:r="http://schemas.openxmlformats.org/officeDocument/2006/relationships" xmlns:m="http://schemas.openxmlformats.org/officeDocument/2006/math" xmlns:v="urn:schemas-microsoft-com:vml" xmlns:wp14="http://schemas.microsoft.com/office/word/2010/wordprocessingDrawing" xmlns:wp="http://schemas.openxmlformats.org/drawingml/2006/wordprocessingDrawing" xmlns:w10="urn:schemas-microsoft-com:office:word" xmlns:w="http://schemas.openxmlformats.org/wordprocessingml/2006/main" xmlns:w14="http://schemas.microsoft.com/office/word/2010/wordml" xmlns:w15="http://schemas.microsoft.com/office/word/2012/wordml" xmlns:w16cei="http://schemas.microsoft.com/office/word/2026/wordml/cei" xmlns:w16cex="http://schemas.microsoft.com/office/word/2018/wordml/cex" xmlns:w16cid="http://schemas.microsoft.com/office/word/2016/wordml/cid" xmlns:w16="http://schemas.microsoft.com/office/word/2018/wordml" xmlns:w16du="http://schemas.microsoft.com/office/word/2023/wordml/word16du" xmlns:w16sdtdh="http://schemas.microsoft.com/office/word/2020/wordml/sdtdatahash" xmlns:w16sdtfl="http://schemas.microsoft.com/office/word/2024/wordml/sdtformatlock" xmlns:w16se="http://schemas.microsoft.com/office/word/2015/wordml/symex" xmlns:wpg="http://schemas.microsoft.com/office/word/2010/wordprocessingGroup" xmlns:wpi="http://schemas.microsoft.com/office/word/2010/wordprocessingInk" xmlns:wne="http://schemas.microsoft.com/office/word/2006/wordml" xmlns:wps="http://schemas.microsoft.com/office/word/2010/wordprocessingShape" mc:Ignorable="w14 w15 w16se w16cid w16 w16cex w16sdtdh w16sdtfl w16du wp14">
+<w:document xmlns:wpc="http://schemas.microsoft.com/office/word/2010/wordprocessingCanvas" xmlns:cx="http://schemas.microsoft.com/office/drawing/2014/chartex" xmlns:cx1="http://schemas.microsoft.com/office/drawing/2015/9/8/chartex" xmlns:cx2="http://schemas.microsoft.com/office/drawing/2015/10/21/chartex" xmlns:cx3="http://schemas.microsoft.com/office/drawing/2016/5/9/chartex" xmlns:cx4="http://schemas.microsoft.com/office/drawing/2016/5/10/chartex" xmlns:cx5="http://schemas.microsoft.com/office/drawing/2016/5/11/chartex" xmlns:cx6="http://schemas.microsoft.com/office/drawing/2016/5/12/chartex" xmlns:cx7="http://schemas.microsoft.com/office/drawing/2016/5/13/chartex" xmlns:cx8="http://schemas.microsoft.com/office/drawing/2016/5/14/chartex" xmlns:mc="http://schemas.openxmlformats.org/markup-compatibility/2006" xmlns:aink="http://schemas.microsoft.com/office/drawing/2016/ink" xmlns:am3d="http://schemas.microsoft.com/office/drawing/2017/model3d" xmlns:o="urn:schemas-microsoft-com:office:office" xmlns:oel="http://schemas.microsoft.com/office/2019/extlst" xmlns:r="http://schemas.openxmlformats.org/officeDocument/2006/relationships" xmlns:m="http://schemas.openxmlformats.org/officeDocument/2006/math" xmlns:v="urn:schemas-microsoft-com:vml" xmlns:wp14="http://schemas.microsoft.com/office/word/2010/wordprocessingDrawing" xmlns:wp="http://schemas.openxmlformats.org/drawingml/2006/wordprocessingDrawing" xmlns:w10="urn:schemas-microsoft-com:office:word" xmlns:w="http://schemas.openxmlformats.org/wordprocessingml/2006/main" xmlns:w14="http://schemas.microsoft.com/office/word/2010/wordml" xmlns:w15="http://schemas.microsoft.com/office/word/2012/wordml" xmlns:w16cex="http://schemas.microsoft.com/office/word/2018/wordml/cex" xmlns:w16cid="http://schemas.microsoft.com/office/word/2016/wordml/cid" xmlns:w16="http://schemas.microsoft.com/office/word/2018/wordml" xmlns:w16du="http://schemas.microsoft.com/office/word/2023/wordml/word16du" xmlns:w16sdtdh="http://schemas.microsoft.com/office/word/2020/wordml/sdtdatahash" xmlns:w16sdtfl="http://schemas.microsoft.com/office/word/2024/wordml/sdtformatlock" xmlns:w16se="http://schemas.microsoft.com/office/word/2015/wordml/symex" xmlns:wpg="http://schemas.microsoft.com/office/word/2010/wordprocessingGroup" xmlns:wpi="http://schemas.microsoft.com/office/word/2010/wordprocessingInk" xmlns:wne="http://schemas.microsoft.com/office/word/2006/wordml" xmlns:wps="http://schemas.microsoft.com/office/word/2010/wordprocessingShape" mc:Ignorable="w14 w15 w16se w16cid w16 w16cex w16sdtdh w16sdtfl w16du wp14">
   <w:body>
     <w:p>
       <w:pPr>
@@ -48,7 +48,7 @@
       </w:pPr>
       <w:r>
         <w:pict w14:anchorId="36850DC8">
-          <v:rect id="_x0000_i1049" style="width:358.2pt;height:.75pt" o:hrpct="0" o:hralign="center" o:hrstd="t" o:hr="t" fillcolor="#a0a0a0" stroked="f"/>
+          <v:rect id="_x0000_i1025" style="width:358.2pt;height:.75pt" o:hrpct="0" o:hralign="center" o:hrstd="t" o:hr="t" fillcolor="#a0a0a0" stroked="f"/>
         </w:pict>
       </w:r>
     </w:p>
@@ -85,7 +85,7 @@
       <w:r>
         <w:t>Truy cập vào đường dẫn Web Portal: </w:t>
       </w:r>
-      <w:hyperlink r:id="rId6" w:history="1">
+      <w:hyperlink r:id="rId8" w:history="1">
         <w:r>
           <w:rPr>
             <w:rStyle w:val="Hyperlink"/>
@@ -242,7 +242,7 @@
     <w:p>
       <w:r>
         <w:pict w14:anchorId="296E7505">
-          <v:rect id="_x0000_i1050" style="width:358.2pt;height:.75pt" o:hrpct="0" o:hralign="center" o:hrstd="t" o:hr="t" fillcolor="#a0a0a0" stroked="f"/>
+          <v:rect id="_x0000_i1026" style="width:358.2pt;height:.75pt" o:hrpct="0" o:hralign="center" o:hrstd="t" o:hr="t" fillcolor="#a0a0a0" stroked="f"/>
         </w:pict>
       </w:r>
     </w:p>
@@ -459,7 +459,7 @@
     <w:p>
       <w:r>
         <w:pict w14:anchorId="0D8BFF9C">
-          <v:rect id="_x0000_i1051" style="width:358.2pt;height:.75pt" o:hrpct="0" o:hralign="center" o:hrstd="t" o:hr="t" fillcolor="#a0a0a0" stroked="f"/>
+          <v:rect id="_x0000_i1027" style="width:358.2pt;height:.75pt" o:hrpct="0" o:hralign="center" o:hrstd="t" o:hr="t" fillcolor="#a0a0a0" stroked="f"/>
         </w:pict>
       </w:r>
     </w:p>
@@ -792,7 +792,7 @@
       </w:pPr>
       <w:r>
         <w:pict w14:anchorId="4ED9BF64">
-          <v:rect id="_x0000_i1052" style="width:358.2pt;height:.75pt" o:hrpct="0" o:hralign="center" o:hrstd="t" o:hr="t" fillcolor="#a0a0a0" stroked="f"/>
+          <v:rect id="_x0000_i1028" style="width:358.2pt;height:.75pt" o:hrpct="0" o:hralign="center" o:hrstd="t" o:hr="t" fillcolor="#a0a0a0" stroked="f"/>
         </w:pict>
       </w:r>
     </w:p>
@@ -977,6 +977,7 @@
           <w:b/>
           <w:sz w:val="28"/>
         </w:rPr>
+        <w:lastRenderedPageBreak/>
         <w:t>PHẦN II: HƯỚNG DẪN DÀNH CHO QUẢN LÝ KINH DOANH (ASM) &amp; QUẢN TRỊ VIÊN (ADMIN)</w:t>
       </w:r>
     </w:p>
@@ -998,7 +999,6 @@
         <w:rPr>
           <w:rFonts w:ascii="Segoe UI Emoji" w:hAnsi="Segoe UI Emoji"/>
           <w:b/>
-          <w:sz w:val="24"/>
         </w:rPr>
         <w:t xml:space="preserve">🛡️ </w:t>
       </w:r>
@@ -1006,7 +1006,6 @@
         <w:rPr>
           <w:rFonts w:ascii="Arial" w:hAnsi="Arial"/>
           <w:b/>
-          <w:sz w:val="24"/>
         </w:rPr>
         <w:t>BƯỚC 1: ĐĂNG NHẬP PHÂN QUYỀN CAO CẤP</w:t>
       </w:r>
@@ -1020,14 +1019,19 @@
           <w:rFonts w:ascii="Arial" w:hAnsi="Arial"/>
           <w:sz w:val="22"/>
         </w:rPr>
-        <w:t xml:space="preserve">  • </w:t>
-      </w:r>
+        <w:t xml:space="preserve">  • Với vai trò là ASM (Quản lý cụm):</w:t>
+      </w:r>
+    </w:p>
+    <w:p>
+      <w:pPr>
+        <w:spacing w:after="80"/>
+      </w:pPr>
       <w:r>
         <w:rPr>
           <w:rFonts w:ascii="Arial" w:hAnsi="Arial"/>
           <w:sz w:val="22"/>
         </w:rPr>
-        <w:t>Với vai trò là ASM (Quản lý cụm):</w:t>
+        <w:t xml:space="preserve">  • Tại ô chọn ASM, chọn đúng tên của bạn.</w:t>
       </w:r>
     </w:p>
     <w:p>
@@ -1039,14 +1043,19 @@
           <w:rFonts w:ascii="Arial" w:hAnsi="Arial"/>
           <w:sz w:val="22"/>
         </w:rPr>
-        <w:t xml:space="preserve">  • </w:t>
-      </w:r>
+        <w:t xml:space="preserve">  • Tại ô chọn Cửa hàng, hệ thống sẽ tự động hiển thị lựa chọn: '🔑 [Đăng nhập quyền ASM &lt;Tên&gt;]'. Chọn dòng này.</w:t>
+      </w:r>
+    </w:p>
+    <w:p>
+      <w:pPr>
+        <w:spacing w:after="80"/>
+      </w:pPr>
       <w:r>
         <w:rPr>
           <w:rFonts w:ascii="Arial" w:hAnsi="Arial"/>
           <w:sz w:val="22"/>
         </w:rPr>
-        <w:t>Tại ô chọn ASM, chọn đúng tên của bạn.</w:t>
+        <w:t xml:space="preserve">  • Nhập mã PIN cá nhân của ASM để đăng nhập vào trang quản trị của cụm.</w:t>
       </w:r>
     </w:p>
     <w:p>
@@ -1058,14 +1067,19 @@
           <w:rFonts w:ascii="Arial" w:hAnsi="Arial"/>
           <w:sz w:val="22"/>
         </w:rPr>
-        <w:t xml:space="preserve">  • </w:t>
-      </w:r>
+        <w:t xml:space="preserve">  • Với vai trò là Admin (Quản trị viên hệ thống):</w:t>
+      </w:r>
+    </w:p>
+    <w:p>
+      <w:pPr>
+        <w:spacing w:after="80"/>
+      </w:pPr>
       <w:r>
         <w:rPr>
           <w:rFonts w:ascii="Arial" w:hAnsi="Arial"/>
           <w:sz w:val="22"/>
         </w:rPr>
-        <w:t>Tại ô chọn Cửa hàng, hệ thống sẽ tự động hiển thị lựa chọn: '🔑 [Đăng nhập quyền ASM &lt;Tên&gt;]'. Chọn dòng này.</w:t>
+        <w:t xml:space="preserve">  • Tại ô chọn ASM, chọn dòng: '🔑 [ADMIN - QUẢN TRỊ VIÊN]'.</w:t>
       </w:r>
     </w:p>
     <w:p>
@@ -1077,14 +1091,38 @@
           <w:rFonts w:ascii="Arial" w:hAnsi="Arial"/>
           <w:sz w:val="22"/>
         </w:rPr>
-        <w:t xml:space="preserve">  • </w:t>
-      </w:r>
+        <w:t xml:space="preserve">  • Nhập mã PIN Admin hệ thống (mặc định là 8888) để vào Dashboard tổng quyền tối cao.</w:t>
+      </w:r>
+    </w:p>
+    <w:p>
+      <w:pPr>
+        <w:spacing w:before="240" w:after="80"/>
+      </w:pPr>
+      <w:r>
+        <w:rPr>
+          <w:rFonts w:ascii="Segoe UI Emoji" w:hAnsi="Segoe UI Emoji"/>
+          <w:b/>
+        </w:rPr>
+        <w:t xml:space="preserve">📊 </w:t>
+      </w:r>
+      <w:r>
+        <w:rPr>
+          <w:rFonts w:ascii="Arial" w:hAnsi="Arial"/>
+          <w:b/>
+        </w:rPr>
+        <w:t>BƯỚC 2: THEO DÕI BÁO CÁO CÁC CỬA HÀNG (Tab "Tiến Độ Nộp Tuần")</w:t>
+      </w:r>
+    </w:p>
+    <w:p>
+      <w:pPr>
+        <w:spacing w:after="80"/>
+      </w:pPr>
       <w:r>
         <w:rPr>
           <w:rFonts w:ascii="Arial" w:hAnsi="Arial"/>
           <w:sz w:val="22"/>
         </w:rPr>
-        <w:t>Nhập mã PIN cá nhân của ASM để đăng nhập vào trang quản trị của cụm.</w:t>
+        <w:t xml:space="preserve">  • Xem nhanh trạng thái nộp báo cáo của tất cả các cửa hàng trực thuộc cụm (Đã nộp có tích xanh, Chưa nộp có cảnh báo đỏ).</w:t>
       </w:r>
     </w:p>
     <w:p>
@@ -1096,14 +1134,38 @@
           <w:rFonts w:ascii="Arial" w:hAnsi="Arial"/>
           <w:sz w:val="22"/>
         </w:rPr>
-        <w:t xml:space="preserve">  • </w:t>
-      </w:r>
+        <w:t xml:space="preserve">  • Xem và so sánh tỷ lệ chuyển đổi (CR%) thực tế của từng cửa hàng trong tuần hiện tại.</w:t>
+      </w:r>
+    </w:p>
+    <w:p>
+      <w:pPr>
+        <w:spacing w:after="80"/>
+      </w:pPr>
       <w:r>
         <w:rPr>
           <w:rFonts w:ascii="Arial" w:hAnsi="Arial"/>
           <w:sz w:val="22"/>
         </w:rPr>
-        <w:t>Với vai trò là Admin (Quản trị viên hệ thống):</w:t>
+        <w:t xml:space="preserve">  • Bấm nút '📋 Chi Tiết' tại dòng của bất kỳ cửa hàng nào để xem chi tiết bài nộp hoặc nhập liệu thay thế cho cửa hàng đó.</w:t>
+      </w:r>
+    </w:p>
+    <w:p>
+      <w:pPr>
+        <w:spacing w:before="240" w:after="80"/>
+      </w:pPr>
+      <w:r>
+        <w:rPr>
+          <w:rFonts w:ascii="Segoe UI Emoji" w:hAnsi="Segoe UI Emoji"/>
+          <w:b/>
+        </w:rPr>
+        <w:t xml:space="preserve">📈 </w:t>
+      </w:r>
+      <w:r>
+        <w:rPr>
+          <w:rFonts w:ascii="Arial" w:hAnsi="Arial"/>
+          <w:b/>
+        </w:rPr>
+        <w:t>BƯỚC 3: BÁO CÁO NHANH HỆ THỐNG (Nút "Xem Báo Cáo Nhanh")</w:t>
       </w:r>
     </w:p>
     <w:p>
@@ -1115,14 +1177,19 @@
           <w:rFonts w:ascii="Arial" w:hAnsi="Arial"/>
           <w:sz w:val="22"/>
         </w:rPr>
-        <w:t xml:space="preserve">  • </w:t>
-      </w:r>
+        <w:t xml:space="preserve">  • Nút '📊 Xem Báo Cáo Nhanh' được đặt nổi bật ở cả thanh điều khiển Admin và góc trên Tab Nhân Sự.</w:t>
+      </w:r>
+    </w:p>
+    <w:p>
+      <w:pPr>
+        <w:spacing w:after="80"/>
+      </w:pPr>
       <w:r>
         <w:rPr>
           <w:rFonts w:ascii="Arial" w:hAnsi="Arial"/>
           <w:sz w:val="22"/>
         </w:rPr>
-        <w:t>Tại ô chọn ASM, chọn dòng: '🔑 [ADMIN - QUẢN TRỊ VIÊN]'.</w:t>
+        <w:t xml:space="preserve">  • Khi nhấn vào, hệ thống hiển thị biểu đồ tổng hợp toàn bộ lượt khách (Traffic), doanh số và tỷ lệ chuyển đổi (CR) của cả cụm/hệ thống.</w:t>
       </w:r>
     </w:p>
     <w:p>
@@ -1134,35 +1201,38 @@
           <w:rFonts w:ascii="Arial" w:hAnsi="Arial"/>
           <w:sz w:val="22"/>
         </w:rPr>
-        <w:t xml:space="preserve">  • </w:t>
-      </w:r>
+        <w:t xml:space="preserve">  • Phân tích trực quan các lý do khách không mua hàng (như Đứt size, Thiếu mẫu, Giá cao, v.v.) theo tỷ lệ phần trăm để hỗ trợ ra quyết định điều chuyển hàng hóa tức thì.</w:t>
+      </w:r>
+    </w:p>
+    <w:p>
+      <w:pPr>
+        <w:spacing w:before="240" w:after="80"/>
+      </w:pPr>
+      <w:r>
+        <w:rPr>
+          <w:rFonts w:ascii="Segoe UI Emoji" w:hAnsi="Segoe UI Emoji"/>
+          <w:b/>
+        </w:rPr>
+        <w:t xml:space="preserve">👥 </w:t>
+      </w:r>
+      <w:r>
+        <w:rPr>
+          <w:rFonts w:ascii="Arial" w:hAnsi="Arial"/>
+          <w:b/>
+        </w:rPr>
+        <w:t>BƯỚC 4: ĐỊNH BIÊN &amp; BÁO CÁO NHÂN SỰ CỤM (Tab "Nhân Sự Cụm")</w:t>
+      </w:r>
+    </w:p>
+    <w:p>
+      <w:pPr>
+        <w:spacing w:after="80"/>
+      </w:pPr>
       <w:r>
         <w:rPr>
           <w:rFonts w:ascii="Arial" w:hAnsi="Arial"/>
           <w:sz w:val="22"/>
         </w:rPr>
-        <w:t>Nhập mã PIN Admin hệ thống (mặc định là 8888) để vào Dashboard tổng quyền tối cao.</w:t>
-      </w:r>
-    </w:p>
-    <w:p>
-      <w:pPr>
-        <w:spacing w:before="240" w:after="80"/>
-      </w:pPr>
-      <w:r>
-        <w:rPr>
-          <w:rFonts w:ascii="Segoe UI Emoji" w:hAnsi="Segoe UI Emoji"/>
-          <w:b/>
-          <w:sz w:val="24"/>
-        </w:rPr>
-        <w:t xml:space="preserve">📊 </w:t>
-      </w:r>
-      <w:r>
-        <w:rPr>
-          <w:rFonts w:ascii="Arial" w:hAnsi="Arial"/>
-          <w:b/>
-          <w:sz w:val="24"/>
-        </w:rPr>
-        <w:t>BƯỚC 2: THEO DÕI BÁO CÁO CÁC CỬA HÀNG (Tab "Tiến Độ Nộp Tuần")</w:t>
+        <w:t xml:space="preserve">  • Biểu đồ Thâm Niên: Phân tích tỷ lệ nhân sự theo thâm niên làm việc (Dưới 3 tháng, 3m-1 năm, 1-3 năm, 3-5 năm, trên 5 năm).</w:t>
       </w:r>
     </w:p>
     <w:p>
@@ -1174,289 +1244,23 @@
           <w:rFonts w:ascii="Arial" w:hAnsi="Arial"/>
           <w:sz w:val="22"/>
         </w:rPr>
-        <w:t xml:space="preserve">  • </w:t>
-      </w:r>
+        <w:t xml:space="preserve">  • Cơ cấu Chức Danh: Biểu đồ tròn hiển thị cơ cấu số lượng CHT, CHP, NVBH và Bảo vệ.</w:t>
+      </w:r>
+    </w:p>
+    <w:p>
+      <w:pPr>
+        <w:spacing w:after="80"/>
+      </w:pPr>
       <w:r>
         <w:rPr>
           <w:rFonts w:ascii="Arial" w:hAnsi="Arial"/>
           <w:sz w:val="22"/>
         </w:rPr>
-        <w:t>Xem nhanh trạng thái nộp báo cáo của tất cả các cửa hàng trực thuộc cụm (Đã nộp có tích xanh, Chưa nộp có cảnh báo đỏ).</w:t>
-      </w:r>
-    </w:p>
-    <w:p>
-      <w:pPr>
-        <w:spacing w:after="80"/>
-      </w:pPr>
-      <w:r>
-        <w:rPr>
-          <w:rFonts w:ascii="Arial" w:hAnsi="Arial"/>
-          <w:sz w:val="22"/>
-        </w:rPr>
-        <w:t xml:space="preserve">  • </w:t>
-      </w:r>
-      <w:r>
-        <w:rPr>
-          <w:rFonts w:ascii="Arial" w:hAnsi="Arial"/>
-          <w:sz w:val="22"/>
-        </w:rPr>
-        <w:t>Xem và so sánh tỷ lệ chuyển đổi (CR%) thực tế của từng cửa hàng trong tuần hiện tại.</w:t>
-      </w:r>
-    </w:p>
-    <w:p>
-      <w:pPr>
-        <w:spacing w:after="80"/>
-      </w:pPr>
-      <w:r>
-        <w:rPr>
-          <w:rFonts w:ascii="Arial" w:hAnsi="Arial"/>
-          <w:sz w:val="22"/>
-        </w:rPr>
-        <w:t xml:space="preserve">  • </w:t>
-      </w:r>
-      <w:r>
-        <w:rPr>
-          <w:rFonts w:ascii="Arial" w:hAnsi="Arial"/>
-          <w:sz w:val="22"/>
-        </w:rPr>
-        <w:t>Bấm nút '📋 Chi Tiết' tại dòng của bất kỳ cửa hàng nào để xem chi tiết bài nộp hoặc nhập liệu thay thế cho cửa hàng đó.</w:t>
-      </w:r>
-    </w:p>
-    <w:p>
-      <w:pPr>
-        <w:spacing w:before="240" w:after="80"/>
-      </w:pPr>
-      <w:r>
-        <w:rPr>
-          <w:rFonts w:ascii="Segoe UI Emoji" w:hAnsi="Segoe UI Emoji"/>
-          <w:b/>
-          <w:sz w:val="24"/>
-        </w:rPr>
-        <w:t xml:space="preserve">📈 </w:t>
-      </w:r>
-      <w:r>
-        <w:rPr>
-          <w:rFonts w:ascii="Arial" w:hAnsi="Arial"/>
-          <w:b/>
-          <w:sz w:val="24"/>
-        </w:rPr>
-        <w:t>BƯỚC 3: BÁO CÁO NHANH HỆ THỐNG (Nút "Xem Báo Cáo Nhanh")</w:t>
-      </w:r>
-    </w:p>
-    <w:p>
-      <w:pPr>
-        <w:spacing w:after="80"/>
-      </w:pPr>
-      <w:r>
-        <w:rPr>
-          <w:rFonts w:ascii="Arial" w:hAnsi="Arial"/>
-          <w:sz w:val="22"/>
-        </w:rPr>
-        <w:t xml:space="preserve">  • </w:t>
-      </w:r>
-      <w:r>
-        <w:rPr>
-          <w:rFonts w:ascii="Arial" w:hAnsi="Arial"/>
-          <w:sz w:val="22"/>
-        </w:rPr>
-        <w:t>Nút '📊 Xem Báo Cáo Nhanh' được đặt nổi bật ở cả thanh điều khiển Admin và góc trên Tab Nhân Sự.</w:t>
-      </w:r>
-    </w:p>
-    <w:p>
-      <w:pPr>
-        <w:spacing w:after="80"/>
-      </w:pPr>
-      <w:r>
-        <w:rPr>
-          <w:rFonts w:ascii="Arial" w:hAnsi="Arial"/>
-          <w:sz w:val="22"/>
-        </w:rPr>
-        <w:t xml:space="preserve">  • </w:t>
-      </w:r>
-      <w:r>
-        <w:rPr>
-          <w:rFonts w:ascii="Arial" w:hAnsi="Arial"/>
-          <w:sz w:val="22"/>
-        </w:rPr>
-        <w:t>Khi nhấn vào, hệ thống hiển thị biểu đồ tổng hợp toàn bộ lượt khách (Traffic), doanh số và tỷ lệ chuyển đổi (CR) của cả cụm/hệ thống.</w:t>
-      </w:r>
-    </w:p>
-    <w:p>
-      <w:pPr>
-        <w:spacing w:after="80"/>
-      </w:pPr>
-      <w:r>
-        <w:rPr>
-          <w:rFonts w:ascii="Arial" w:hAnsi="Arial"/>
-          <w:sz w:val="22"/>
-        </w:rPr>
-        <w:t xml:space="preserve">  • </w:t>
-      </w:r>
-      <w:r>
-        <w:rPr>
-          <w:rFonts w:ascii="Arial" w:hAnsi="Arial"/>
-          <w:sz w:val="22"/>
-        </w:rPr>
-        <w:t>Phân tích trực quan các lý do khách không mua hàng (như Đứt size, Thiếu mẫu, Giá cao, v.v.) theo tỷ lệ phần trăm để hỗ trợ ra quyết định điều chuyển hàng hóa tức thì.</w:t>
-      </w:r>
-    </w:p>
-    <w:p>
-      <w:pPr>
-        <w:spacing w:before="240" w:after="80"/>
-      </w:pPr>
-      <w:r>
-        <w:rPr>
-          <w:rFonts w:ascii="Segoe UI Emoji" w:hAnsi="Segoe UI Emoji"/>
-          <w:b/>
-          <w:sz w:val="24"/>
-        </w:rPr>
-        <w:t xml:space="preserve">👥 </w:t>
-      </w:r>
-      <w:r>
-        <w:rPr>
-          <w:rFonts w:ascii="Arial" w:hAnsi="Arial"/>
-          <w:b/>
-          <w:sz w:val="24"/>
-        </w:rPr>
-        <w:t>BƯỚC 4: ĐỊNH BIÊN &amp; BÁO CÁO NHÂN SỰ CỤM (Tab "Nhân Sự Cụm")</w:t>
-      </w:r>
-    </w:p>
-    <w:p>
-      <w:pPr>
-        <w:spacing w:after="80"/>
-      </w:pPr>
-      <w:r>
-        <w:rPr>
-          <w:rFonts w:ascii="Arial" w:hAnsi="Arial"/>
-          <w:sz w:val="22"/>
-        </w:rPr>
-        <w:t xml:space="preserve">  • </w:t>
-      </w:r>
-      <w:r>
-        <w:rPr>
-          <w:rFonts w:ascii="Arial" w:hAnsi="Arial"/>
-          <w:sz w:val="22"/>
-        </w:rPr>
-        <w:t>Biểu đồ Thâm Niên: Phân tích tỷ lệ nhân sự theo thâm niên làm việc (Dưới 3 tháng, 3m-1 năm, 1-3 năm, 3-5 năm, trên 5 năm).</w:t>
-      </w:r>
-    </w:p>
-    <w:p>
-      <w:pPr>
-        <w:spacing w:after="80"/>
-      </w:pPr>
-      <w:r>
-        <w:rPr>
-          <w:rFonts w:ascii="Arial" w:hAnsi="Arial"/>
-          <w:sz w:val="22"/>
-        </w:rPr>
-        <w:t xml:space="preserve">  • </w:t>
-      </w:r>
-      <w:r>
-        <w:rPr>
-          <w:rFonts w:ascii="Arial" w:hAnsi="Arial"/>
-          <w:sz w:val="22"/>
-        </w:rPr>
-        <w:t>Cơ cấu Chức Danh: Biểu đồ tròn hiển thị cơ cấu số lượng CHT, CHP, NVBH và Bảo vệ.</w:t>
-      </w:r>
-    </w:p>
-    <w:p>
-      <w:pPr>
-        <w:spacing w:after="80"/>
-      </w:pPr>
-      <w:r>
-        <w:rPr>
-          <w:rFonts w:ascii="Arial" w:hAnsi="Arial"/>
-          <w:sz w:val="22"/>
-        </w:rPr>
-        <w:t xml:space="preserve">  • </w:t>
-      </w:r>
-      <w:r>
-        <w:rPr>
-          <w:rFonts w:ascii="Arial" w:hAnsi="Arial"/>
-          <w:sz w:val="22"/>
-        </w:rPr>
-        <w:t>Bảng Định Biên: So sánh chi tiết chỉ tiêu Định biên và nhân sự Thực tế của từng cửa hàng trong cụm để thấy ngay tình trạng Thừa/Thiếu nhân sự.</w:t>
-      </w:r>
-    </w:p>
-    <w:p>
-      <w:pPr>
-        <w:spacing w:before="240" w:after="80"/>
-      </w:pPr>
-      <w:r>
-        <w:rPr>
-          <w:rFonts w:ascii="Segoe UI Emoji" w:hAnsi="Segoe UI Emoji"/>
-          <w:b/>
-          <w:sz w:val="24"/>
-        </w:rPr>
-        <w:t xml:space="preserve">🔄 </w:t>
-      </w:r>
-      <w:r>
-        <w:rPr>
-          <w:rFonts w:ascii="Arial" w:hAnsi="Arial"/>
-          <w:b/>
-          <w:sz w:val="24"/>
-        </w:rPr>
-        <w:t>BƯỚC 5: QUẢN LÝ MÃ PIN &amp; ĐỒNG BỘ CỤM ASM (Chỉ dành cho ADMIN)</w:t>
-      </w:r>
-    </w:p>
-    <w:p>
-      <w:pPr>
-        <w:spacing w:after="80"/>
-      </w:pPr>
-      <w:r>
-        <w:rPr>
-          <w:rFonts w:ascii="Arial" w:hAnsi="Arial"/>
-          <w:sz w:val="22"/>
-        </w:rPr>
-        <w:t xml:space="preserve">  • </w:t>
-      </w:r>
-      <w:r>
-        <w:rPr>
-          <w:rFonts w:ascii="Arial" w:hAnsi="Arial"/>
-          <w:sz w:val="22"/>
-        </w:rPr>
-        <w:t>Thay đổi mã PIN: Cập nhật mã PIN đăng nhập mới cho bất kỳ ASM hoặc cửa hàng nào.</w:t>
-      </w:r>
-    </w:p>
-    <w:p>
-      <w:pPr>
-        <w:spacing w:after="80"/>
-      </w:pPr>
-      <w:r>
-        <w:rPr>
-          <w:rFonts w:ascii="Arial" w:hAnsi="Arial"/>
-          <w:sz w:val="22"/>
-        </w:rPr>
-        <w:t xml:space="preserve">  • </w:t>
-      </w:r>
-      <w:r>
-        <w:rPr>
-          <w:rFonts w:ascii="Arial" w:hAnsi="Arial"/>
-          <w:sz w:val="22"/>
-        </w:rPr>
-        <w:t>Phân cụm ASM trực tiếp: Thay đổi ASM quản lý của từng cửa hàng trực tiếp thông qua hộp chọn Dropdown ngay trên bảng. Số liệu sẽ được cập nhật tức thì lên cơ sở dữ liệu cloud mà không cần viết code.</w:t>
-      </w:r>
-    </w:p>
-    <w:p>
-      <w:pPr>
-        <w:spacing w:after="80"/>
-      </w:pPr>
-      <w:r>
-        <w:rPr>
-          <w:rFonts w:ascii="Arial" w:hAnsi="Arial"/>
-          <w:sz w:val="22"/>
-        </w:rPr>
-        <w:t xml:space="preserve">  • </w:t>
-      </w:r>
-      <w:r>
-        <w:rPr>
-          <w:rFonts w:ascii="Arial" w:hAnsi="Arial"/>
-          <w:sz w:val="22"/>
-        </w:rPr>
-        <w:t>Đồng bộ hàng loạt từ Excel: Bấm nút '🔄 Đồng Bộ Lại từ Excel StoresInfo' để cập nhật lại danh sách 184 cửa hàng và phân cụm ASM theo file dữ liệu gốc StoresInfo.xlsx cột J.</w:t>
+        <w:t xml:space="preserve">  • Bảng Định Biên: So sánh chi tiết chỉ tiêu Định biên và nhân sự Thực tế của từng cửa hàng trong cụm để thấy ngay tình trạng Thừa/Thiếu nhân sự.</w:t>
       </w:r>
     </w:p>
     <w:sectPr>
+      <w:headerReference w:type="default" r:id="rId9"/>
       <w:pgSz w:w="11906" w:h="16838"/>
       <w:pgMar w:top="1440" w:right="1440" w:bottom="1440" w:left="1440" w:header="708" w:footer="708" w:gutter="0"/>
       <w:cols w:space="708"/>
@@ -1466,8 +1270,80 @@
 </w:document>
 </file>
 
+<file path=word/endnotes.xml><?xml version="1.0" encoding="utf-8"?>
+<w:endnotes xmlns:wpc="http://schemas.microsoft.com/office/word/2010/wordprocessingCanvas" xmlns:cx="http://schemas.microsoft.com/office/drawing/2014/chartex" xmlns:cx1="http://schemas.microsoft.com/office/drawing/2015/9/8/chartex" xmlns:cx2="http://schemas.microsoft.com/office/drawing/2015/10/21/chartex" xmlns:cx3="http://schemas.microsoft.com/office/drawing/2016/5/9/chartex" xmlns:cx4="http://schemas.microsoft.com/office/drawing/2016/5/10/chartex" xmlns:cx5="http://schemas.microsoft.com/office/drawing/2016/5/11/chartex" xmlns:cx6="http://schemas.microsoft.com/office/drawing/2016/5/12/chartex" xmlns:cx7="http://schemas.microsoft.com/office/drawing/2016/5/13/chartex" xmlns:cx8="http://schemas.microsoft.com/office/drawing/2016/5/14/chartex" xmlns:mc="http://schemas.openxmlformats.org/markup-compatibility/2006" xmlns:aink="http://schemas.microsoft.com/office/drawing/2016/ink" xmlns:am3d="http://schemas.microsoft.com/office/drawing/2017/model3d" xmlns:o="urn:schemas-microsoft-com:office:office" xmlns:oel="http://schemas.microsoft.com/office/2019/extlst" xmlns:r="http://schemas.openxmlformats.org/officeDocument/2006/relationships" xmlns:m="http://schemas.openxmlformats.org/officeDocument/2006/math" xmlns:v="urn:schemas-microsoft-com:vml" xmlns:wp14="http://schemas.microsoft.com/office/word/2010/wordprocessingDrawing" xmlns:wp="http://schemas.openxmlformats.org/drawingml/2006/wordprocessingDrawing" xmlns:w10="urn:schemas-microsoft-com:office:word" xmlns:w="http://schemas.openxmlformats.org/wordprocessingml/2006/main" xmlns:w14="http://schemas.microsoft.com/office/word/2010/wordml" xmlns:w15="http://schemas.microsoft.com/office/word/2012/wordml" xmlns:w16cex="http://schemas.microsoft.com/office/word/2018/wordml/cex" xmlns:w16cid="http://schemas.microsoft.com/office/word/2016/wordml/cid" xmlns:w16="http://schemas.microsoft.com/office/word/2018/wordml" xmlns:w16du="http://schemas.microsoft.com/office/word/2023/wordml/word16du" xmlns:w16sdtdh="http://schemas.microsoft.com/office/word/2020/wordml/sdtdatahash" xmlns:w16sdtfl="http://schemas.microsoft.com/office/word/2024/wordml/sdtformatlock" xmlns:w16se="http://schemas.microsoft.com/office/word/2015/wordml/symex" xmlns:wpg="http://schemas.microsoft.com/office/word/2010/wordprocessingGroup" xmlns:wpi="http://schemas.microsoft.com/office/word/2010/wordprocessingInk" xmlns:wne="http://schemas.microsoft.com/office/word/2006/wordml" xmlns:wps="http://schemas.microsoft.com/office/word/2010/wordprocessingShape" mc:Ignorable="w14 w15 w16se w16cid w16 w16cex w16sdtdh w16sdtfl w16du wp14">
+  <w:endnote w:type="separator" w:id="-1">
+    <w:p>
+      <w:pPr>
+        <w:spacing w:after="0" w:line="240" w:lineRule="auto"/>
+      </w:pPr>
+      <w:r>
+        <w:separator/>
+      </w:r>
+    </w:p>
+  </w:endnote>
+  <w:endnote w:type="continuationSeparator" w:id="0">
+    <w:p>
+      <w:pPr>
+        <w:spacing w:after="0" w:line="240" w:lineRule="auto"/>
+      </w:pPr>
+      <w:r>
+        <w:continuationSeparator/>
+      </w:r>
+    </w:p>
+  </w:endnote>
+</w:endnotes>
+</file>
+
+<file path=word/footnotes.xml><?xml version="1.0" encoding="utf-8"?>
+<w:footnotes xmlns:wpc="http://schemas.microsoft.com/office/word/2010/wordprocessingCanvas" xmlns:cx="http://schemas.microsoft.com/office/drawing/2014/chartex" xmlns:cx1="http://schemas.microsoft.com/office/drawing/2015/9/8/chartex" xmlns:cx2="http://schemas.microsoft.com/office/drawing/2015/10/21/chartex" xmlns:cx3="http://schemas.microsoft.com/office/drawing/2016/5/9/chartex" xmlns:cx4="http://schemas.microsoft.com/office/drawing/2016/5/10/chartex" xmlns:cx5="http://schemas.microsoft.com/office/drawing/2016/5/11/chartex" xmlns:cx6="http://schemas.microsoft.com/office/drawing/2016/5/12/chartex" xmlns:cx7="http://schemas.microsoft.com/office/drawing/2016/5/13/chartex" xmlns:cx8="http://schemas.microsoft.com/office/drawing/2016/5/14/chartex" xmlns:mc="http://schemas.openxmlformats.org/markup-compatibility/2006" xmlns:aink="http://schemas.microsoft.com/office/drawing/2016/ink" xmlns:am3d="http://schemas.microsoft.com/office/drawing/2017/model3d" xmlns:o="urn:schemas-microsoft-com:office:office" xmlns:oel="http://schemas.microsoft.com/office/2019/extlst" xmlns:r="http://schemas.openxmlformats.org/officeDocument/2006/relationships" xmlns:m="http://schemas.openxmlformats.org/officeDocument/2006/math" xmlns:v="urn:schemas-microsoft-com:vml" xmlns:wp14="http://schemas.microsoft.com/office/word/2010/wordprocessingDrawing" xmlns:wp="http://schemas.openxmlformats.org/drawingml/2006/wordprocessingDrawing" xmlns:w10="urn:schemas-microsoft-com:office:word" xmlns:w="http://schemas.openxmlformats.org/wordprocessingml/2006/main" xmlns:w14="http://schemas.microsoft.com/office/word/2010/wordml" xmlns:w15="http://schemas.microsoft.com/office/word/2012/wordml" xmlns:w16cex="http://schemas.microsoft.com/office/word/2018/wordml/cex" xmlns:w16cid="http://schemas.microsoft.com/office/word/2016/wordml/cid" xmlns:w16="http://schemas.microsoft.com/office/word/2018/wordml" xmlns:w16du="http://schemas.microsoft.com/office/word/2023/wordml/word16du" xmlns:w16sdtdh="http://schemas.microsoft.com/office/word/2020/wordml/sdtdatahash" xmlns:w16sdtfl="http://schemas.microsoft.com/office/word/2024/wordml/sdtformatlock" xmlns:w16se="http://schemas.microsoft.com/office/word/2015/wordml/symex" xmlns:wpg="http://schemas.microsoft.com/office/word/2010/wordprocessingGroup" xmlns:wpi="http://schemas.microsoft.com/office/word/2010/wordprocessingInk" xmlns:wne="http://schemas.microsoft.com/office/word/2006/wordml" xmlns:wps="http://schemas.microsoft.com/office/word/2010/wordprocessingShape" mc:Ignorable="w14 w15 w16se w16cid w16 w16cex w16sdtdh w16sdtfl w16du wp14">
+  <w:footnote w:type="separator" w:id="-1">
+    <w:p>
+      <w:pPr>
+        <w:spacing w:after="0" w:line="240" w:lineRule="auto"/>
+      </w:pPr>
+      <w:r>
+        <w:separator/>
+      </w:r>
+    </w:p>
+  </w:footnote>
+  <w:footnote w:type="continuationSeparator" w:id="0">
+    <w:p>
+      <w:pPr>
+        <w:spacing w:after="0" w:line="240" w:lineRule="auto"/>
+      </w:pPr>
+      <w:r>
+        <w:continuationSeparator/>
+      </w:r>
+    </w:p>
+  </w:footnote>
+</w:footnotes>
+</file>
+
+<file path=word/header1.xml><?xml version="1.0" encoding="utf-8"?>
+<w:hdr xmlns:wpc="http://schemas.microsoft.com/office/word/2010/wordprocessingCanvas" xmlns:cx="http://schemas.microsoft.com/office/drawing/2014/chartex" xmlns:cx1="http://schemas.microsoft.com/office/drawing/2015/9/8/chartex" xmlns:cx2="http://schemas.microsoft.com/office/drawing/2015/10/21/chartex" xmlns:cx3="http://schemas.microsoft.com/office/drawing/2016/5/9/chartex" xmlns:cx4="http://schemas.microsoft.com/office/drawing/2016/5/10/chartex" xmlns:cx5="http://schemas.microsoft.com/office/drawing/2016/5/11/chartex" xmlns:cx6="http://schemas.microsoft.com/office/drawing/2016/5/12/chartex" xmlns:cx7="http://schemas.microsoft.com/office/drawing/2016/5/13/chartex" xmlns:cx8="http://schemas.microsoft.com/office/drawing/2016/5/14/chartex" xmlns:mc="http://schemas.openxmlformats.org/markup-compatibility/2006" xmlns:aink="http://schemas.microsoft.com/office/drawing/2016/ink" xmlns:am3d="http://schemas.microsoft.com/office/drawing/2017/model3d" xmlns:o="urn:schemas-microsoft-com:office:office" xmlns:oel="http://schemas.microsoft.com/office/2019/extlst" xmlns:r="http://schemas.openxmlformats.org/officeDocument/2006/relationships" xmlns:m="http://schemas.openxmlformats.org/officeDocument/2006/math" xmlns:v="urn:schemas-microsoft-com:vml" xmlns:wp14="http://schemas.microsoft.com/office/word/2010/wordprocessingDrawing" xmlns:wp="http://schemas.openxmlformats.org/drawingml/2006/wordprocessingDrawing" xmlns:w10="urn:schemas-microsoft-com:office:word" xmlns:w="http://schemas.openxmlformats.org/wordprocessingml/2006/main" xmlns:w14="http://schemas.microsoft.com/office/word/2010/wordml" xmlns:w15="http://schemas.microsoft.com/office/word/2012/wordml" xmlns:w16cex="http://schemas.microsoft.com/office/word/2018/wordml/cex" xmlns:w16cid="http://schemas.microsoft.com/office/word/2016/wordml/cid" xmlns:w16="http://schemas.microsoft.com/office/word/2018/wordml" xmlns:w16du="http://schemas.microsoft.com/office/word/2023/wordml/word16du" xmlns:w16sdtdh="http://schemas.microsoft.com/office/word/2020/wordml/sdtdatahash" xmlns:w16sdtfl="http://schemas.microsoft.com/office/word/2024/wordml/sdtformatlock" xmlns:w16se="http://schemas.microsoft.com/office/word/2015/wordml/symex" xmlns:wpg="http://schemas.microsoft.com/office/word/2010/wordprocessingGroup" xmlns:wpi="http://schemas.microsoft.com/office/word/2010/wordprocessingInk" xmlns:wne="http://schemas.microsoft.com/office/word/2006/wordml" xmlns:wps="http://schemas.microsoft.com/office/word/2010/wordprocessingShape" mc:Ignorable="w14 w15 w16se w16cid w16 w16cex w16sdtdh w16sdtfl w16du wp14">
+  <w:p>
+    <w:pPr>
+      <w:pStyle w:val="Header"/>
+      <w:jc w:val="right"/>
+      <w:rPr>
+        <w:i/>
+        <w:iCs/>
+      </w:rPr>
+    </w:pPr>
+    <w:r>
+      <w:rPr>
+        <w:i/>
+        <w:iCs/>
+      </w:rPr>
+      <w:t>Tài liệu nội bộ _ Webapp By: Khôi Nguyễn</w:t>
+    </w:r>
+  </w:p>
+</w:hdr>
+</file>
+
 <file path=word/numbering.xml><?xml version="1.0" encoding="utf-8"?>
-<w:numbering xmlns:wpc="http://schemas.microsoft.com/office/word/2010/wordprocessingCanvas" xmlns:cx="http://schemas.microsoft.com/office/drawing/2014/chartex" xmlns:cx1="http://schemas.microsoft.com/office/drawing/2015/9/8/chartex" xmlns:cx2="http://schemas.microsoft.com/office/drawing/2015/10/21/chartex" xmlns:cx3="http://schemas.microsoft.com/office/drawing/2016/5/9/chartex" xmlns:cx4="http://schemas.microsoft.com/office/drawing/2016/5/10/chartex" xmlns:cx5="http://schemas.microsoft.com/office/drawing/2016/5/11/chartex" xmlns:cx6="http://schemas.microsoft.com/office/drawing/2016/5/12/chartex" xmlns:cx7="http://schemas.microsoft.com/office/drawing/2016/5/13/chartex" xmlns:cx8="http://schemas.microsoft.com/office/drawing/2016/5/14/chartex" xmlns:mc="http://schemas.openxmlformats.org/markup-compatibility/2006" xmlns:aink="http://schemas.microsoft.com/office/drawing/2016/ink" xmlns:am3d="http://schemas.microsoft.com/office/drawing/2017/model3d" xmlns:o="urn:schemas-microsoft-com:office:office" xmlns:oel="http://schemas.microsoft.com/office/2019/extlst" xmlns:r="http://schemas.openxmlformats.org/officeDocument/2006/relationships" xmlns:m="http://schemas.openxmlformats.org/officeDocument/2006/math" xmlns:v="urn:schemas-microsoft-com:vml" xmlns:wp14="http://schemas.microsoft.com/office/word/2010/wordprocessingDrawing" xmlns:wp="http://schemas.openxmlformats.org/drawingml/2006/wordprocessingDrawing" xmlns:w10="urn:schemas-microsoft-com:office:word" xmlns:w="http://schemas.openxmlformats.org/wordprocessingml/2006/main" xmlns:w14="http://schemas.microsoft.com/office/word/2010/wordml" xmlns:w15="http://schemas.microsoft.com/office/word/2012/wordml" xmlns:w16cei="http://schemas.microsoft.com/office/word/2026/wordml/cei" xmlns:w16cex="http://schemas.microsoft.com/office/word/2018/wordml/cex" xmlns:w16cid="http://schemas.microsoft.com/office/word/2016/wordml/cid" xmlns:w16="http://schemas.microsoft.com/office/word/2018/wordml" xmlns:w16du="http://schemas.microsoft.com/office/word/2023/wordml/word16du" xmlns:w16sdtdh="http://schemas.microsoft.com/office/word/2020/wordml/sdtdatahash" xmlns:w16sdtfl="http://schemas.microsoft.com/office/word/2024/wordml/sdtformatlock" xmlns:w16se="http://schemas.microsoft.com/office/word/2015/wordml/symex" xmlns:wpg="http://schemas.microsoft.com/office/word/2010/wordprocessingGroup" xmlns:wpi="http://schemas.microsoft.com/office/word/2010/wordprocessingInk" xmlns:wne="http://schemas.microsoft.com/office/word/2006/wordml" xmlns:wps="http://schemas.microsoft.com/office/word/2010/wordprocessingShape" mc:Ignorable="w14 w15 w16se w16cid w16 w16cex w16sdtdh w16sdtfl w16du wp14">
+<w:numbering xmlns:wpc="http://schemas.microsoft.com/office/word/2010/wordprocessingCanvas" xmlns:cx="http://schemas.microsoft.com/office/drawing/2014/chartex" xmlns:cx1="http://schemas.microsoft.com/office/drawing/2015/9/8/chartex" xmlns:cx2="http://schemas.microsoft.com/office/drawing/2015/10/21/chartex" xmlns:cx3="http://schemas.microsoft.com/office/drawing/2016/5/9/chartex" xmlns:cx4="http://schemas.microsoft.com/office/drawing/2016/5/10/chartex" xmlns:cx5="http://schemas.microsoft.com/office/drawing/2016/5/11/chartex" xmlns:cx6="http://schemas.microsoft.com/office/drawing/2016/5/12/chartex" xmlns:cx7="http://schemas.microsoft.com/office/drawing/2016/5/13/chartex" xmlns:cx8="http://schemas.microsoft.com/office/drawing/2016/5/14/chartex" xmlns:mc="http://schemas.openxmlformats.org/markup-compatibility/2006" xmlns:aink="http://schemas.microsoft.com/office/drawing/2016/ink" xmlns:am3d="http://schemas.microsoft.com/office/drawing/2017/model3d" xmlns:o="urn:schemas-microsoft-com:office:office" xmlns:oel="http://schemas.microsoft.com/office/2019/extlst" xmlns:r="http://schemas.openxmlformats.org/officeDocument/2006/relationships" xmlns:m="http://schemas.openxmlformats.org/officeDocument/2006/math" xmlns:v="urn:schemas-microsoft-com:vml" xmlns:wp14="http://schemas.microsoft.com/office/word/2010/wordprocessingDrawing" xmlns:wp="http://schemas.openxmlformats.org/drawingml/2006/wordprocessingDrawing" xmlns:w10="urn:schemas-microsoft-com:office:word" xmlns:w="http://schemas.openxmlformats.org/wordprocessingml/2006/main" xmlns:w14="http://schemas.microsoft.com/office/word/2010/wordml" xmlns:w15="http://schemas.microsoft.com/office/word/2012/wordml" xmlns:w16cex="http://schemas.microsoft.com/office/word/2018/wordml/cex" xmlns:w16cid="http://schemas.microsoft.com/office/word/2016/wordml/cid" xmlns:w16="http://schemas.microsoft.com/office/word/2018/wordml" xmlns:w16du="http://schemas.microsoft.com/office/word/2023/wordml/word16du" xmlns:w16sdtdh="http://schemas.microsoft.com/office/word/2020/wordml/sdtdatahash" xmlns:w16sdtfl="http://schemas.microsoft.com/office/word/2024/wordml/sdtformatlock" xmlns:w16se="http://schemas.microsoft.com/office/word/2015/wordml/symex" xmlns:wpg="http://schemas.microsoft.com/office/word/2010/wordprocessingGroup" xmlns:wpi="http://schemas.microsoft.com/office/word/2010/wordprocessingInk" xmlns:wne="http://schemas.microsoft.com/office/word/2006/wordml" xmlns:wps="http://schemas.microsoft.com/office/word/2010/wordprocessingShape" mc:Ignorable="w14 w15 w16se w16cid w16 w16cex w16sdtdh w16sdtfl w16du wp14">
   <w:abstractNum w:abstractNumId="0" w15:restartNumberingAfterBreak="0">
     <w:nsid w:val="15DD6798"/>
     <w:multiLevelType w:val="multilevel"/>
@@ -2702,6 +2578,7 @@
   <w:style w:type="character" w:default="1" w:styleId="DefaultParagraphFont">
     <w:name w:val="Default Paragraph Font"/>
     <w:uiPriority w:val="1"/>
+    <w:semiHidden/>
     <w:unhideWhenUsed/>
   </w:style>
   <w:style w:type="table" w:default="1" w:styleId="TableNormal">
@@ -3037,6 +2914,50 @@
       <w:color w:val="605E5C"/>
       <w:shd w:val="clear" w:color="auto" w:fill="E1DFDD"/>
     </w:rPr>
+  </w:style>
+  <w:style w:type="paragraph" w:styleId="Header">
+    <w:name w:val="header"/>
+    <w:basedOn w:val="Normal"/>
+    <w:link w:val="HeaderChar"/>
+    <w:uiPriority w:val="99"/>
+    <w:unhideWhenUsed/>
+    <w:rsid w:val="004110C4"/>
+    <w:pPr>
+      <w:tabs>
+        <w:tab w:val="center" w:pos="4513"/>
+        <w:tab w:val="right" w:pos="9026"/>
+      </w:tabs>
+      <w:spacing w:after="0" w:line="240" w:lineRule="auto"/>
+    </w:pPr>
+  </w:style>
+  <w:style w:type="character" w:customStyle="1" w:styleId="HeaderChar">
+    <w:name w:val="Header Char"/>
+    <w:basedOn w:val="DefaultParagraphFont"/>
+    <w:link w:val="Header"/>
+    <w:uiPriority w:val="99"/>
+    <w:rsid w:val="004110C4"/>
+  </w:style>
+  <w:style w:type="paragraph" w:styleId="Footer">
+    <w:name w:val="footer"/>
+    <w:basedOn w:val="Normal"/>
+    <w:link w:val="FooterChar"/>
+    <w:uiPriority w:val="99"/>
+    <w:unhideWhenUsed/>
+    <w:rsid w:val="004110C4"/>
+    <w:pPr>
+      <w:tabs>
+        <w:tab w:val="center" w:pos="4513"/>
+        <w:tab w:val="right" w:pos="9026"/>
+      </w:tabs>
+      <w:spacing w:after="0" w:line="240" w:lineRule="auto"/>
+    </w:pPr>
+  </w:style>
+  <w:style w:type="character" w:customStyle="1" w:styleId="FooterChar">
+    <w:name w:val="Footer Char"/>
+    <w:basedOn w:val="DefaultParagraphFont"/>
+    <w:link w:val="Footer"/>
+    <w:uiPriority w:val="99"/>
+    <w:rsid w:val="004110C4"/>
   </w:style>
 </w:styles>
 </file>

</xml_diff>